<commit_message>
feat: mejorar ensamblaje 3D del PC (AIO, GPU, RGB y anti-flicker)
Ajusta radiador/fans/tubos AIO, asiento de GPU/RAM, ciclo RGB blanco-rojo-azul-arcoiris y reduce z-fighting; añade Anime.js 3 en el hero.

Co-authored-by: Cursor <cursoragent@cursor.com>
</commit_message>
<xml_diff>
--- a/docs/TECNOLOGIAS.docx
+++ b/docs/TECNOLOGIAS.docx
@@ -39,69 +39,267 @@
     <w:p>
       <w:pPr>
         <w:rPr>
-          <w:lang w:val="es-PE"/>
-        </w:rPr>
-      </w:pPr>
-      <w:r>
-        <w:rPr>
           <w:b/>
-          <w:lang w:val="es-PE"/>
-        </w:rPr>
-        <w:t>Proyecto:</w:t>
-      </w:r>
-      <w:r>
-        <w:rPr>
-          <w:lang w:val="es-PE"/>
-        </w:rPr>
-        <w:t xml:space="preserve"> Sitio web corporativo de NEXT TECHNOLOGIES (soporte técnico en Jaén, Perú)</w:t>
+          <w:bCs/>
+          <w:lang w:val="es-PE"/>
+        </w:rPr>
+      </w:pPr>
+      <w:r>
+        <w:rPr>
+          <w:b/>
+          <w:lang w:val="es-PE"/>
+        </w:rPr>
+        <w:t>Proyecto</w:t>
+      </w:r>
+      <w:r>
+        <w:rPr>
+          <w:rFonts w:ascii="Segoe UI" w:eastAsia="Times New Roman" w:hAnsi="Segoe UI" w:cs="Segoe UI"/>
+          <w:color w:val="auto"/>
+          <w:sz w:val="34"/>
+          <w:szCs w:val="34"/>
+          <w:lang w:val="es-PE" w:eastAsia="es-PE"/>
+        </w:rPr>
+        <w:t xml:space="preserve"> </w:t>
+      </w:r>
+      <w:r>
+        <w:rPr>
+          <w:b/>
+          <w:bCs/>
+          <w:lang w:val="es-PE"/>
+        </w:rPr>
+        <w:t>¿Qué tipo de sitio es?</w:t>
       </w:r>
     </w:p>
     <w:p>
       <w:pPr>
         <w:rPr>
-          <w:lang w:val="es-PE"/>
-        </w:rPr>
-      </w:pPr>
+          <w:bCs/>
+          <w:lang w:val="es-PE"/>
+        </w:rPr>
+      </w:pPr>
+      <w:r>
+        <w:rPr>
+          <w:bCs/>
+          <w:lang w:val="es-PE"/>
+        </w:rPr>
+        <w:t>Es un sitio web corporativo de una sola página (también llamado </w:t>
+      </w:r>
+      <w:proofErr w:type="spellStart"/>
       <w:r>
         <w:rPr>
           <w:b/>
-          <w:lang w:val="es-PE"/>
-        </w:rPr>
-        <w:t>Tipo de aplicación:</w:t>
-      </w:r>
-      <w:r>
-        <w:rPr>
-          <w:lang w:val="es-PE"/>
-        </w:rPr>
-        <w:t xml:space="preserve"> Página de una sola vista (</w:t>
+          <w:i/>
+          <w:iCs/>
+          <w:lang w:val="es-PE"/>
+        </w:rPr>
+        <w:t>landing</w:t>
+      </w:r>
+      <w:proofErr w:type="spellEnd"/>
+      <w:r>
+        <w:rPr>
+          <w:b/>
+          <w:i/>
+          <w:iCs/>
+          <w:lang w:val="es-PE"/>
+        </w:rPr>
+        <w:t xml:space="preserve"> page</w:t>
+      </w:r>
+      <w:r>
+        <w:rPr>
+          <w:b/>
+          <w:lang w:val="es-PE"/>
+        </w:rPr>
+        <w:t> </w:t>
+      </w:r>
+      <w:proofErr w:type="spellStart"/>
+      <w:r>
+        <w:rPr>
+          <w:bCs/>
+          <w:lang w:val="es-PE"/>
+        </w:rPr>
+        <w:t>o</w:t>
+      </w:r>
+      <w:proofErr w:type="spellEnd"/>
+      <w:r>
+        <w:rPr>
+          <w:bCs/>
+          <w:lang w:val="es-PE"/>
+        </w:rPr>
+        <w:t> </w:t>
+      </w:r>
+      <w:r>
+        <w:rPr>
+          <w:bCs/>
+          <w:i/>
+          <w:iCs/>
+          <w:lang w:val="es-PE"/>
+        </w:rPr>
+        <w:t>one-page site</w:t>
+      </w:r>
+      <w:r>
+        <w:rPr>
+          <w:bCs/>
+          <w:lang w:val="es-PE"/>
+        </w:rPr>
+        <w:t>) para la empresa NEXT TECHNOLOGIES, negocio de soporte técnico en Jaén, Perú.</w:t>
+      </w:r>
+    </w:p>
+    <w:p>
+      <w:pPr>
+        <w:rPr>
+          <w:bCs/>
+          <w:lang w:val="es-PE"/>
+        </w:rPr>
+      </w:pPr>
+      <w:r>
+        <w:rPr>
+          <w:bCs/>
+          <w:lang w:val="es-PE"/>
+        </w:rPr>
+        <w:t>No es una tienda online ni una red social. Es una página de presentación comercial pensada para:</w:t>
+      </w:r>
+    </w:p>
+    <w:p>
+      <w:pPr>
+        <w:numPr>
+          <w:ilvl w:val="0"/>
+          <w:numId w:val="10"/>
+        </w:numPr>
+        <w:rPr>
+          <w:bCs/>
+          <w:lang w:val="es-PE"/>
+        </w:rPr>
+      </w:pPr>
+      <w:r>
+        <w:rPr>
+          <w:bCs/>
+          <w:lang w:val="es-PE"/>
+        </w:rPr>
+        <w:t>Mostrar quién es la empresa</w:t>
+      </w:r>
+    </w:p>
+    <w:p>
+      <w:pPr>
+        <w:numPr>
+          <w:ilvl w:val="0"/>
+          <w:numId w:val="10"/>
+        </w:numPr>
+        <w:rPr>
+          <w:bCs/>
+          <w:lang w:val="es-PE"/>
+        </w:rPr>
+      </w:pPr>
+      <w:r>
+        <w:rPr>
+          <w:bCs/>
+          <w:lang w:val="es-PE"/>
+        </w:rPr>
+        <w:t>Explicar qué servicios ofrece</w:t>
+      </w:r>
+    </w:p>
+    <w:p>
+      <w:pPr>
+        <w:numPr>
+          <w:ilvl w:val="0"/>
+          <w:numId w:val="10"/>
+        </w:numPr>
+        <w:rPr>
+          <w:bCs/>
+          <w:lang w:val="es-PE"/>
+        </w:rPr>
+      </w:pPr>
+      <w:r>
+        <w:rPr>
+          <w:bCs/>
+          <w:lang w:val="es-PE"/>
+        </w:rPr>
+        <w:t>Generar confianza (equipo, galería, testimonios)</w:t>
+      </w:r>
+    </w:p>
+    <w:p>
+      <w:pPr>
+        <w:numPr>
+          <w:ilvl w:val="0"/>
+          <w:numId w:val="10"/>
+        </w:numPr>
+        <w:rPr>
+          <w:bCs/>
+          <w:lang w:val="es-PE"/>
+        </w:rPr>
+      </w:pPr>
+      <w:r>
+        <w:rPr>
+          <w:bCs/>
+          <w:lang w:val="es-PE"/>
+        </w:rPr>
+        <w:t>Facilitar el contacto y llevar al cliente a WhatsApp</w:t>
+      </w:r>
+    </w:p>
+    <w:p>
+      <w:pPr>
+        <w:rPr>
+          <w:bCs/>
+          <w:lang w:val="es-PE"/>
+        </w:rPr>
+      </w:pPr>
+      <w:r>
+        <w:rPr>
+          <w:bCs/>
+          <w:lang w:val="es-PE"/>
+        </w:rPr>
+        <w:t xml:space="preserve">Técnicamente es una web clásica con PHP + HTML/CSS/JavaScript, con animaciones y un formulario de contacto. No es una </w:t>
       </w:r>
       <w:proofErr w:type="gramStart"/>
       <w:r>
         <w:rPr>
-          <w:lang w:val="es-PE"/>
-        </w:rPr>
-        <w:t>Single</w:t>
+          <w:bCs/>
+          <w:lang w:val="es-PE"/>
+        </w:rPr>
+        <w:t>app</w:t>
       </w:r>
       <w:proofErr w:type="gramEnd"/>
       <w:r>
         <w:rPr>
-          <w:lang w:val="es-PE"/>
-        </w:rPr>
-        <w:t xml:space="preserve"> Page) con </w:t>
+          <w:bCs/>
+          <w:lang w:val="es-PE"/>
+        </w:rPr>
+        <w:t xml:space="preserve"> tipo Facebook, ni un e-</w:t>
       </w:r>
       <w:proofErr w:type="spellStart"/>
       <w:r>
         <w:rPr>
-          <w:lang w:val="es-PE"/>
-        </w:rPr>
-        <w:t>backend</w:t>
+          <w:bCs/>
+          <w:lang w:val="es-PE"/>
+        </w:rPr>
+        <w:t>commerce</w:t>
       </w:r>
       <w:proofErr w:type="spellEnd"/>
       <w:r>
         <w:rPr>
-          <w:lang w:val="es-PE"/>
-        </w:rPr>
-        <w:t xml:space="preserve"> ligero para formulario de contacto</w:t>
+          <w:bCs/>
+          <w:lang w:val="es-PE"/>
+        </w:rPr>
+        <w:t>, ni un panel administrativo.</w:t>
+      </w:r>
+    </w:p>
+    <w:p>
+      <w:pPr>
+        <w:rPr>
+          <w:lang w:val="es-PE"/>
+        </w:rPr>
+      </w:pPr>
+      <w:r>
+        <w:rPr>
+          <w:b/>
+          <w:lang w:val="es-PE"/>
+        </w:rPr>
+        <w:t>:</w:t>
+      </w:r>
+      <w:r>
+        <w:rPr>
+          <w:lang w:val="es-PE"/>
+        </w:rPr>
+        <w:t xml:space="preserve"> Sitio web corporativo de NEXT TECHNOLOGIES (soporte técnico en Jaén, Perú)</w:t>
       </w:r>
     </w:p>
     <w:p>
@@ -523,6 +721,7 @@
         <w:rPr>
           <w:lang w:val="es-PE"/>
         </w:rPr>
+        <w:lastRenderedPageBreak/>
         <w:t>2. Arquitectura general</w:t>
       </w:r>
     </w:p>
@@ -822,7 +1021,6 @@
         <w:rPr>
           <w:lang w:val="es-PE"/>
         </w:rPr>
-        <w:lastRenderedPageBreak/>
         <w:t xml:space="preserve">La </w:t>
       </w:r>
       <w:r>
@@ -1567,6 +1765,7 @@
           <w:b/>
           <w:lang w:val="es-PE"/>
         </w:rPr>
+        <w:lastRenderedPageBreak/>
         <w:t>Log opcional</w:t>
       </w:r>
       <w:r>
@@ -1648,8 +1847,13 @@
       </w:r>
       <w:proofErr w:type="spellEnd"/>
       <w:r>
-        <w:t xml:space="preserve"> sensibles</w:t>
-      </w:r>
+        <w:t xml:space="preserve"> </w:t>
+      </w:r>
+      <w:proofErr w:type="spellStart"/>
+      <w:r>
+        <w:t>sensibles</w:t>
+      </w:r>
+      <w:proofErr w:type="spellEnd"/>
     </w:p>
     <w:p>
       <w:pPr>
@@ -1929,7 +2133,6 @@
                 <w:b/>
                 <w:sz w:val="20"/>
               </w:rPr>
-              <w:lastRenderedPageBreak/>
               <w:t>Componente</w:t>
             </w:r>
             <w:proofErr w:type="spellEnd"/>
@@ -2859,6 +3062,7 @@
         <w:pStyle w:val="Ttulo3"/>
       </w:pPr>
       <w:r>
+        <w:lastRenderedPageBreak/>
         <w:t>4.3 Formulario de contacto</w:t>
       </w:r>
     </w:p>
@@ -3217,7 +3421,6 @@
                 <w:color w:val="1E40AF"/>
                 <w:sz w:val="20"/>
               </w:rPr>
-              <w:lastRenderedPageBreak/>
               <w:t>css</w:t>
             </w:r>
             <w:proofErr w:type="spellEnd"/>
@@ -3643,8 +3846,13 @@
       </w:r>
       <w:proofErr w:type="spellEnd"/>
       <w:r>
-        <w:t xml:space="preserve"> empleadas</w:t>
-      </w:r>
+        <w:t xml:space="preserve"> </w:t>
+      </w:r>
+      <w:proofErr w:type="spellStart"/>
+      <w:r>
+        <w:t>empleadas</w:t>
+      </w:r>
+      <w:proofErr w:type="spellEnd"/>
     </w:p>
     <w:p>
       <w:pPr>
@@ -4130,6 +4338,7 @@
         <w:pStyle w:val="Ttulo2"/>
       </w:pPr>
       <w:r>
+        <w:lastRenderedPageBreak/>
         <w:t>6. JavaScript (cliente)</w:t>
       </w:r>
     </w:p>
@@ -4579,7 +4788,6 @@
         <w:rPr>
           <w:lang w:val="es-PE"/>
         </w:rPr>
-        <w:lastRenderedPageBreak/>
         <w:t>6.2 Funcionalidades implementadas en `main.js`</w:t>
       </w:r>
     </w:p>
@@ -5306,6 +5514,7 @@
         <w:pStyle w:val="Ttulo2"/>
       </w:pPr>
       <w:r>
+        <w:lastRenderedPageBreak/>
         <w:t>7. Animaciones: GSAP 3 y ScrollTrigger</w:t>
       </w:r>
     </w:p>
@@ -5767,7 +5976,6 @@
         <w:rPr>
           <w:lang w:val="es-PE"/>
         </w:rPr>
-        <w:lastRenderedPageBreak/>
         <w:t>7.2 Loader de entrada (`</w:t>
       </w:r>
       <w:proofErr w:type="spellStart"/>
@@ -6396,6 +6604,7 @@
         <w:rPr>
           <w:lang w:val="es-PE"/>
         </w:rPr>
+        <w:lastRenderedPageBreak/>
         <w:t>8.2 Configuración vía data-</w:t>
       </w:r>
       <w:proofErr w:type="spellStart"/>
@@ -6634,7 +6843,6 @@
         <w:rPr>
           <w:lang w:val="es-PE"/>
         </w:rPr>
-        <w:lastRenderedPageBreak/>
         <w:t>9. Tipografía e iconografía</w:t>
       </w:r>
     </w:p>
@@ -8057,7 +8265,15 @@
       </w:r>
       <w:proofErr w:type="spellEnd"/>
       <w:r>
-        <w:t xml:space="preserve"> (`npm run build`)</w:t>
+        <w:t xml:space="preserve"> (`</w:t>
+      </w:r>
+      <w:proofErr w:type="spellStart"/>
+      <w:r>
+        <w:t>npm</w:t>
+      </w:r>
+      <w:proofErr w:type="spellEnd"/>
+      <w:r>
+        <w:t xml:space="preserve"> run build`)</w:t>
       </w:r>
     </w:p>
     <w:tbl>
@@ -8669,6 +8885,7 @@
         <w:rPr>
           <w:lang w:val="es-PE"/>
         </w:rPr>
+        <w:lastRenderedPageBreak/>
         <w:t>12. Seguridad</w:t>
       </w:r>
     </w:p>
@@ -9064,7 +9281,6 @@
               <w:rPr>
                 <w:sz w:val="20"/>
               </w:rPr>
-              <w:lastRenderedPageBreak/>
               <w:t>Validación</w:t>
             </w:r>
             <w:proofErr w:type="spellEnd"/>
@@ -10219,15 +10435,6 @@
           <w:lang w:val="es-PE"/>
         </w:rPr>
         <w:br/>
-      </w:r>
-      <w:r>
-        <w:rPr>
-          <w:rFonts w:ascii="Consolas" w:hAnsi="Consolas"/>
-          <w:color w:val="334155"/>
-          <w:sz w:val="18"/>
-          <w:lang w:val="es-PE"/>
-        </w:rPr>
-        <w:lastRenderedPageBreak/>
         <w:t>│</w:t>
       </w:r>
       <w:r>
@@ -10258,19 +10465,8 @@
           <w:sz w:val="18"/>
           <w:lang w:val="es-PE"/>
         </w:rPr>
-        <w:t xml:space="preserve"> </w:t>
-      </w:r>
-      <w:proofErr w:type="spellStart"/>
-      <w:r>
-        <w:rPr>
-          <w:rFonts w:ascii="Consolas" w:hAnsi="Consolas"/>
-          <w:color w:val="334155"/>
-          <w:sz w:val="18"/>
-          <w:lang w:val="es-PE"/>
-        </w:rPr>
-        <w:t>Vercel</w:t>
-      </w:r>
-      <w:proofErr w:type="spellEnd"/>
+        <w:t xml:space="preserve"> Vercel</w:t>
+      </w:r>
       <w:r>
         <w:rPr>
           <w:rFonts w:ascii="Consolas" w:hAnsi="Consolas"/>
@@ -11058,6 +11254,7 @@
                 <w:sz w:val="20"/>
                 <w:lang w:val="es-PE"/>
               </w:rPr>
+              <w:lastRenderedPageBreak/>
               <w:t>Base de datos (MySQL, PostgreSQL, etc.)</w:t>
             </w:r>
           </w:p>
@@ -11382,7 +11579,6 @@
         <w:pStyle w:val="Ttulo2"/>
       </w:pPr>
       <w:r>
-        <w:lastRenderedPageBreak/>
         <w:t>17. Mantenimiento habitual</w:t>
       </w:r>
     </w:p>
@@ -12095,6 +12291,155 @@
       </w:pPr>
       <w:rPr>
         <w:rFonts w:ascii="Symbol" w:hAnsi="Symbol" w:hint="default"/>
+      </w:rPr>
+    </w:lvl>
+  </w:abstractNum>
+  <w:abstractNum w:abstractNumId="9" w15:restartNumberingAfterBreak="0">
+    <w:nsid w:val="023D0EDC"/>
+    <w:multiLevelType w:val="multilevel"/>
+    <w:tmpl w:val="7F2E77AC"/>
+    <w:lvl w:ilvl="0">
+      <w:start w:val="1"/>
+      <w:numFmt w:val="bullet"/>
+      <w:lvlText w:val=""/>
+      <w:lvlJc w:val="left"/>
+      <w:pPr>
+        <w:tabs>
+          <w:tab w:val="num" w:pos="720"/>
+        </w:tabs>
+        <w:ind w:left="720" w:hanging="360"/>
+      </w:pPr>
+      <w:rPr>
+        <w:rFonts w:ascii="Symbol" w:hAnsi="Symbol" w:hint="default"/>
+        <w:sz w:val="20"/>
+      </w:rPr>
+    </w:lvl>
+    <w:lvl w:ilvl="1" w:tentative="1">
+      <w:start w:val="1"/>
+      <w:numFmt w:val="bullet"/>
+      <w:lvlText w:val=""/>
+      <w:lvlJc w:val="left"/>
+      <w:pPr>
+        <w:tabs>
+          <w:tab w:val="num" w:pos="1440"/>
+        </w:tabs>
+        <w:ind w:left="1440" w:hanging="360"/>
+      </w:pPr>
+      <w:rPr>
+        <w:rFonts w:ascii="Symbol" w:hAnsi="Symbol" w:hint="default"/>
+        <w:sz w:val="20"/>
+      </w:rPr>
+    </w:lvl>
+    <w:lvl w:ilvl="2" w:tentative="1">
+      <w:start w:val="1"/>
+      <w:numFmt w:val="bullet"/>
+      <w:lvlText w:val=""/>
+      <w:lvlJc w:val="left"/>
+      <w:pPr>
+        <w:tabs>
+          <w:tab w:val="num" w:pos="2160"/>
+        </w:tabs>
+        <w:ind w:left="2160" w:hanging="360"/>
+      </w:pPr>
+      <w:rPr>
+        <w:rFonts w:ascii="Symbol" w:hAnsi="Symbol" w:hint="default"/>
+        <w:sz w:val="20"/>
+      </w:rPr>
+    </w:lvl>
+    <w:lvl w:ilvl="3" w:tentative="1">
+      <w:start w:val="1"/>
+      <w:numFmt w:val="bullet"/>
+      <w:lvlText w:val=""/>
+      <w:lvlJc w:val="left"/>
+      <w:pPr>
+        <w:tabs>
+          <w:tab w:val="num" w:pos="2880"/>
+        </w:tabs>
+        <w:ind w:left="2880" w:hanging="360"/>
+      </w:pPr>
+      <w:rPr>
+        <w:rFonts w:ascii="Symbol" w:hAnsi="Symbol" w:hint="default"/>
+        <w:sz w:val="20"/>
+      </w:rPr>
+    </w:lvl>
+    <w:lvl w:ilvl="4" w:tentative="1">
+      <w:start w:val="1"/>
+      <w:numFmt w:val="bullet"/>
+      <w:lvlText w:val=""/>
+      <w:lvlJc w:val="left"/>
+      <w:pPr>
+        <w:tabs>
+          <w:tab w:val="num" w:pos="3600"/>
+        </w:tabs>
+        <w:ind w:left="3600" w:hanging="360"/>
+      </w:pPr>
+      <w:rPr>
+        <w:rFonts w:ascii="Symbol" w:hAnsi="Symbol" w:hint="default"/>
+        <w:sz w:val="20"/>
+      </w:rPr>
+    </w:lvl>
+    <w:lvl w:ilvl="5" w:tentative="1">
+      <w:start w:val="1"/>
+      <w:numFmt w:val="bullet"/>
+      <w:lvlText w:val=""/>
+      <w:lvlJc w:val="left"/>
+      <w:pPr>
+        <w:tabs>
+          <w:tab w:val="num" w:pos="4320"/>
+        </w:tabs>
+        <w:ind w:left="4320" w:hanging="360"/>
+      </w:pPr>
+      <w:rPr>
+        <w:rFonts w:ascii="Symbol" w:hAnsi="Symbol" w:hint="default"/>
+        <w:sz w:val="20"/>
+      </w:rPr>
+    </w:lvl>
+    <w:lvl w:ilvl="6" w:tentative="1">
+      <w:start w:val="1"/>
+      <w:numFmt w:val="bullet"/>
+      <w:lvlText w:val=""/>
+      <w:lvlJc w:val="left"/>
+      <w:pPr>
+        <w:tabs>
+          <w:tab w:val="num" w:pos="5040"/>
+        </w:tabs>
+        <w:ind w:left="5040" w:hanging="360"/>
+      </w:pPr>
+      <w:rPr>
+        <w:rFonts w:ascii="Symbol" w:hAnsi="Symbol" w:hint="default"/>
+        <w:sz w:val="20"/>
+      </w:rPr>
+    </w:lvl>
+    <w:lvl w:ilvl="7" w:tentative="1">
+      <w:start w:val="1"/>
+      <w:numFmt w:val="bullet"/>
+      <w:lvlText w:val=""/>
+      <w:lvlJc w:val="left"/>
+      <w:pPr>
+        <w:tabs>
+          <w:tab w:val="num" w:pos="5760"/>
+        </w:tabs>
+        <w:ind w:left="5760" w:hanging="360"/>
+      </w:pPr>
+      <w:rPr>
+        <w:rFonts w:ascii="Symbol" w:hAnsi="Symbol" w:hint="default"/>
+        <w:sz w:val="20"/>
+      </w:rPr>
+    </w:lvl>
+    <w:lvl w:ilvl="8" w:tentative="1">
+      <w:start w:val="1"/>
+      <w:numFmt w:val="bullet"/>
+      <w:lvlText w:val=""/>
+      <w:lvlJc w:val="left"/>
+      <w:pPr>
+        <w:tabs>
+          <w:tab w:val="num" w:pos="6480"/>
+        </w:tabs>
+        <w:ind w:left="6480" w:hanging="360"/>
+      </w:pPr>
+      <w:rPr>
+        <w:rFonts w:ascii="Symbol" w:hAnsi="Symbol" w:hint="default"/>
+        <w:sz w:val="20"/>
       </w:rPr>
     </w:lvl>
   </w:abstractNum>
@@ -12124,6 +12469,9 @@
   </w:num>
   <w:num w:numId="9" w16cid:durableId="1409109474">
     <w:abstractNumId w:val="0"/>
+  </w:num>
+  <w:num w:numId="10" w16cid:durableId="877009609">
+    <w:abstractNumId w:val="9"/>
   </w:num>
 </w:numbering>
 </file>
@@ -12736,7 +13084,6 @@
   <w:style w:type="character" w:default="1" w:styleId="Fuentedeprrafopredeter">
     <w:name w:val="Default Paragraph Font"/>
     <w:uiPriority w:val="1"/>
-    <w:semiHidden/>
     <w:unhideWhenUsed/>
   </w:style>
   <w:style w:type="table" w:default="1" w:styleId="Tablanormal">

</xml_diff>